<commit_message>
feat: add postgres graph paths and learning documentation
</commit_message>
<xml_diff>
--- a/docs/DataOps_Troubleshooter_产品设计文档_v2.0.docx
+++ b/docs/DataOps_Troubleshooter_产品设计文档_v2.0.docx
@@ -126,21 +126,7 @@
         <w:widowControl w:val="1"/>
       </w:pPr>
       <w:r>
-        <w:rPr>
-          <w:rFonts w:ascii="Calibri" w:hAnsi="Calibri" w:eastAsia="Microsoft YaHei"/>
-          <w:b/>
-          <w:color w:val="222222"/>
-          <w:sz w:val="21"/>
-        </w:rPr>
-        <w:t>更新日期：</w:t>
-      </w:r>
-      <w:r>
-        <w:rPr>
-          <w:rFonts w:ascii="Calibri" w:hAnsi="Calibri" w:eastAsia="Microsoft YaHei"/>
-          <w:color w:val="222222"/>
-          <w:sz w:val="21"/>
-        </w:rPr>
-        <w:t xml:space="preserve"> 2026-07-10</w:t>
+        <w:t>更新日期： 2026-07-11</w:t>
       </w:r>
     </w:p>
     <w:p>
@@ -3616,6 +3602,20 @@
           <w:rFonts w:ascii="Calibri" w:hAnsi="Calibri" w:eastAsia="Microsoft YaHei"/>
         </w:rPr>
         <w:t>：限制 ReAct 最多 6 步工具行动、2 跳图扩展和 1 次审计返工，均可配置。</w:t>
+      </w:r>
+    </w:p>
+    <w:p>
+      <w:pPr>
+        <w:spacing w:before="0" w:after="160" w:line="280" w:lineRule="auto"/>
+        <w:numPr>
+          <w:ilvl w:val="0"/>
+          <w:numId w:val="10"/>
+        </w:numPr>
+        <w:widowControl w:val="1"/>
+      </w:pPr>
+      <w:pPr/>
+      <w:r>
+        <w:t>学习与求职可解释性：所有人工编写的代码、配置、测试和脚本必须通过模块级注释、关键算法说明和 `docs/implementation-guide.md` 解释文件职责、技术原理、数据流、设计取舍、失败路径与验证方式。注释重点说明“为什么”和“边界”，不得仅逐行复述代码。对于 JSON、锁文件、图片和 DOCX 等无法内嵌注释或机器生成的文件，使用相邻文档、Schema 测试和实现指南说明其结构与生成方式。</w:t>
       </w:r>
     </w:p>
     <w:p>
@@ -14759,6 +14759,20 @@
         </w:numPr>
         <w:widowControl w:val="1"/>
       </w:pPr>
+      <w:pPr/>
+      <w:r>
+        <w:t>面向学习和面试讲解的实现指南，逐项说明技术原理、数据流、关键代码位置、设计取舍、失败路径和验证命令。</w:t>
+      </w:r>
+    </w:p>
+    <w:p>
+      <w:pPr>
+        <w:spacing w:before="0" w:after="160" w:line="280" w:lineRule="auto"/>
+        <w:numPr>
+          <w:ilvl w:val="0"/>
+          <w:numId w:val="10"/>
+        </w:numPr>
+        <w:widowControl w:val="1"/>
+      </w:pPr>
       <w:r>
         <w:rPr>
           <w:rFonts w:ascii="Calibri" w:hAnsi="Calibri" w:eastAsia="Microsoft YaHei"/>

</xml_diff>